<commit_message>
:bento: changed activities in all docs to just one big field
</commit_message>
<xml_diff>
--- a/public/planejamentoDiario1.docx
+++ b/public/planejamentoDiario1.docx
@@ -68,8 +68,8 @@
         <w:tblLook w:val="0000"/>
       </w:tblPr>
       <w:tblGrid>
-        <w:gridCol w:w="2150"/>
-        <w:gridCol w:w="5198"/>
+        <w:gridCol w:w="3107"/>
+        <w:gridCol w:w="7517"/>
       </w:tblGrid>
       <w:tr>
         <w:trPr>
@@ -77,7 +77,7 @@
         </w:trPr>
         <w:tc>
           <w:tcPr>
-            <w:tcW w:w="7348" w:type="dxa"/>
+            <w:tcW w:w="10624" w:type="dxa"/>
             <w:gridSpan w:val="2"/>
             <w:tcBorders>
               <w:top w:val="single" w:sz="8" w:space="0" w:color="000000"/>
@@ -199,7 +199,7 @@
         </w:trPr>
         <w:tc>
           <w:tcPr>
-            <w:tcW w:w="2150" w:type="dxa"/>
+            <w:tcW w:w="3107" w:type="dxa"/>
             <w:tcBorders>
               <w:top w:val="single" w:sz="8" w:space="0" w:color="000000"/>
               <w:left w:val="single" w:sz="8" w:space="0" w:color="000000"/>
@@ -248,7 +248,7 @@
         </w:tc>
         <w:tc>
           <w:tcPr>
-            <w:tcW w:w="5198" w:type="dxa"/>
+            <w:tcW w:w="7517" w:type="dxa"/>
             <w:tcBorders>
               <w:top w:val="single" w:sz="8" w:space="0" w:color="000000"/>
               <w:left w:val="single" w:sz="8" w:space="0" w:color="000000"/>
@@ -302,7 +302,7 @@
         </w:trPr>
         <w:tc>
           <w:tcPr>
-            <w:tcW w:w="2150" w:type="dxa"/>
+            <w:tcW w:w="3107" w:type="dxa"/>
             <w:tcBorders>
               <w:top w:val="single" w:sz="8" w:space="0" w:color="000000"/>
               <w:left w:val="single" w:sz="8" w:space="0" w:color="000000"/>
@@ -401,7 +401,7 @@
         </w:tc>
         <w:tc>
           <w:tcPr>
-            <w:tcW w:w="5198" w:type="dxa"/>
+            <w:tcW w:w="7517" w:type="dxa"/>
             <w:tcBorders>
               <w:top w:val="single" w:sz="8" w:space="0" w:color="000000"/>
               <w:left w:val="single" w:sz="8" w:space="0" w:color="000000"/>
@@ -446,7 +446,7 @@
         </w:trPr>
         <w:tc>
           <w:tcPr>
-            <w:tcW w:w="2150" w:type="dxa"/>
+            <w:tcW w:w="3107" w:type="dxa"/>
             <w:tcBorders>
               <w:top w:val="single" w:sz="8" w:space="0" w:color="000000"/>
               <w:left w:val="single" w:sz="8" w:space="0" w:color="000000"/>
@@ -506,7 +506,7 @@
         </w:tc>
         <w:tc>
           <w:tcPr>
-            <w:tcW w:w="5198" w:type="dxa"/>
+            <w:tcW w:w="7517" w:type="dxa"/>
             <w:tcBorders>
               <w:top w:val="single" w:sz="8" w:space="0" w:color="000000"/>
               <w:left w:val="single" w:sz="8" w:space="0" w:color="000000"/>
@@ -564,7 +564,7 @@
         </w:trPr>
         <w:tc>
           <w:tcPr>
-            <w:tcW w:w="2150" w:type="dxa"/>
+            <w:tcW w:w="3107" w:type="dxa"/>
             <w:tcBorders>
               <w:top w:val="single" w:sz="8" w:space="0" w:color="000000"/>
               <w:left w:val="single" w:sz="8" w:space="0" w:color="000000"/>
@@ -625,7 +625,7 @@
         </w:tc>
         <w:tc>
           <w:tcPr>
-            <w:tcW w:w="5198" w:type="dxa"/>
+            <w:tcW w:w="7517" w:type="dxa"/>
             <w:tcBorders>
               <w:top w:val="single" w:sz="8" w:space="0" w:color="000000"/>
               <w:left w:val="single" w:sz="8" w:space="0" w:color="000000"/>
@@ -735,8 +735,8 @@
         <w:tblLook w:val="0000"/>
       </w:tblPr>
       <w:tblGrid>
-        <w:gridCol w:w="2175"/>
-        <w:gridCol w:w="5048"/>
+        <w:gridCol w:w="3229"/>
+        <w:gridCol w:w="7495"/>
       </w:tblGrid>
       <w:tr>
         <w:trPr>
@@ -744,7 +744,7 @@
         </w:trPr>
         <w:tc>
           <w:tcPr>
-            <w:tcW w:w="2175" w:type="dxa"/>
+            <w:tcW w:w="3229" w:type="dxa"/>
             <w:tcBorders>
               <w:left w:val="single" w:sz="4" w:space="0" w:color="000000"/>
               <w:bottom w:val="single" w:sz="4" w:space="0" w:color="000000"/>
@@ -803,7 +803,7 @@
         </w:tc>
         <w:tc>
           <w:tcPr>
-            <w:tcW w:w="5048" w:type="dxa"/>
+            <w:tcW w:w="7495" w:type="dxa"/>
             <w:tcBorders>
               <w:left w:val="single" w:sz="4" w:space="0" w:color="000000"/>
               <w:bottom w:val="single" w:sz="4" w:space="0" w:color="000000"/>
@@ -870,11 +870,11 @@
       </w:tr>
       <w:tr>
         <w:trPr>
-          <w:trHeight w:val="1979" w:hRule="atLeast"/>
+          <w:trHeight w:val="6948" w:hRule="atLeast"/>
         </w:trPr>
         <w:tc>
           <w:tcPr>
-            <w:tcW w:w="2175" w:type="dxa"/>
+            <w:tcW w:w="3229" w:type="dxa"/>
             <w:tcBorders>
               <w:top w:val="single" w:sz="4" w:space="0" w:color="000000"/>
               <w:left w:val="single" w:sz="4" w:space="0" w:color="000000"/>
@@ -908,7 +908,7 @@
         </w:tc>
         <w:tc>
           <w:tcPr>
-            <w:tcW w:w="5048" w:type="dxa"/>
+            <w:tcW w:w="7495" w:type="dxa"/>
             <w:tcBorders>
               <w:top w:val="single" w:sz="4" w:space="0" w:color="000000"/>
               <w:left w:val="single" w:sz="4" w:space="0" w:color="000000"/>
@@ -947,107 +947,7 @@
                 <w:sz w:val="24"/>
                 <w:szCs w:val="24"/>
               </w:rPr>
-              <w:t>{atividade1_1}</w:t>
-            </w:r>
-          </w:p>
-        </w:tc>
-      </w:tr>
-      <w:tr>
-        <w:trPr>
-          <w:trHeight w:val="3911" w:hRule="atLeast"/>
-        </w:trPr>
-        <w:tc>
-          <w:tcPr>
-            <w:tcW w:w="2175" w:type="dxa"/>
-            <w:tcBorders>
-              <w:top w:val="single" w:sz="4" w:space="0" w:color="000000"/>
-              <w:left w:val="single" w:sz="4" w:space="0" w:color="000000"/>
-              <w:bottom w:val="single" w:sz="4" w:space="0" w:color="000000"/>
-              <w:right w:val="single" w:sz="4" w:space="0" w:color="000000"/>
-            </w:tcBorders>
-          </w:tcPr>
-          <w:p>
-            <w:pPr>
-              <w:pStyle w:val="normal1"/>
-              <w:spacing w:lineRule="auto" w:line="209"/>
-              <w:ind w:hanging="0" w:left="172" w:right="168"/>
-              <w:jc w:val="center"/>
-              <w:rPr>
-                <w:rFonts w:ascii="Arial" w:hAnsi="Arial" w:eastAsia="Arial" w:cs="Arial"/>
-                <w:color w:val="000000"/>
-                <w:sz w:val="24"/>
-                <w:szCs w:val="24"/>
-              </w:rPr>
-            </w:pPr>
-            <w:r>
-              <w:rPr>
-                <w:rFonts w:eastAsia="Arial" w:cs="Arial" w:ascii="Arial" w:hAnsi="Arial"/>
-                <w:color w:val="000000"/>
-                <w:sz w:val="24"/>
-                <w:szCs w:val="24"/>
-              </w:rPr>
-            </w:r>
-          </w:p>
-        </w:tc>
-        <w:tc>
-          <w:tcPr>
-            <w:tcW w:w="5048" w:type="dxa"/>
-            <w:tcBorders>
-              <w:top w:val="single" w:sz="4" w:space="0" w:color="000000"/>
-              <w:left w:val="single" w:sz="4" w:space="0" w:color="000000"/>
-              <w:bottom w:val="single" w:sz="4" w:space="0" w:color="000000"/>
-              <w:right w:val="single" w:sz="4" w:space="0" w:color="000000"/>
-            </w:tcBorders>
-          </w:tcPr>
-          <w:p>
-            <w:pPr>
-              <w:pStyle w:val="normal1"/>
-              <w:spacing w:lineRule="auto" w:line="266"/>
-              <w:rPr>
-                <w:rFonts w:ascii="Arial" w:hAnsi="Arial" w:eastAsia="Arial" w:cs="Arial"/>
-                <w:color w:val="000000"/>
-                <w:sz w:val="24"/>
-                <w:szCs w:val="24"/>
-              </w:rPr>
-            </w:pPr>
-            <w:r>
-              <w:rPr>
-                <w:rFonts w:eastAsia="Arial" w:cs="Arial" w:ascii="Arial" w:hAnsi="Arial"/>
-                <w:b/>
-                <w:color w:val="000000"/>
-                <w:sz w:val="24"/>
-                <w:szCs w:val="24"/>
-              </w:rPr>
-              <w:t>Atividade 02:</w:t>
-            </w:r>
-            <w:r>
-              <w:rPr>
-                <w:rFonts w:eastAsia="Arial" w:cs="Arial" w:ascii="Arial" w:hAnsi="Arial"/>
-                <w:color w:val="000000"/>
-                <w:sz w:val="24"/>
-                <w:szCs w:val="24"/>
-              </w:rPr>
-              <w:t xml:space="preserve"> {atividade1_2}</w:t>
-            </w:r>
-          </w:p>
-          <w:p>
-            <w:pPr>
-              <w:pStyle w:val="normal1"/>
-              <w:spacing w:lineRule="auto" w:line="266"/>
-              <w:rPr>
-                <w:rFonts w:ascii="Arial" w:hAnsi="Arial" w:eastAsia="Arial" w:cs="Arial"/>
-                <w:color w:val="000000"/>
-                <w:sz w:val="24"/>
-                <w:szCs w:val="24"/>
-              </w:rPr>
-            </w:pPr>
-            <w:r>
-              <w:rPr>
-                <w:rFonts w:eastAsia="Arial" w:cs="Arial" w:ascii="Arial" w:hAnsi="Arial"/>
-                <w:color w:val="000000"/>
-                <w:sz w:val="24"/>
-                <w:szCs w:val="24"/>
-              </w:rPr>
+              <w:t>{atividade1}</w:t>
             </w:r>
           </w:p>
         </w:tc>
@@ -1071,6 +971,7 @@
     <w:p>
       <w:pPr>
         <w:pStyle w:val="normal1"/>
+        <w:spacing w:before="0" w:after="0"/>
         <w:rPr>
           <w:color w:val="000000"/>
           <w:sz w:val="20"/>
@@ -1101,8 +1002,8 @@
         <w:tblLook w:val="0000"/>
       </w:tblPr>
       <w:tblGrid>
-        <w:gridCol w:w="2070"/>
-        <w:gridCol w:w="5151"/>
+        <w:gridCol w:w="3044"/>
+        <w:gridCol w:w="7575"/>
       </w:tblGrid>
       <w:tr>
         <w:trPr>
@@ -1110,7 +1011,7 @@
         </w:trPr>
         <w:tc>
           <w:tcPr>
-            <w:tcW w:w="2070" w:type="dxa"/>
+            <w:tcW w:w="3044" w:type="dxa"/>
             <w:tcBorders>
               <w:top w:val="single" w:sz="4" w:space="0" w:color="000000"/>
               <w:left w:val="single" w:sz="4" w:space="0" w:color="000000"/>
@@ -1134,7 +1035,7 @@
         </w:tc>
         <w:tc>
           <w:tcPr>
-            <w:tcW w:w="5151" w:type="dxa"/>
+            <w:tcW w:w="7575" w:type="dxa"/>
             <w:tcBorders>
               <w:top w:val="single" w:sz="4" w:space="0" w:color="000000"/>
               <w:left w:val="single" w:sz="4" w:space="0" w:color="000000"/>
@@ -1148,26 +1049,20 @@
               <w:pStyle w:val="normal1"/>
               <w:spacing w:lineRule="auto" w:line="266"/>
               <w:jc w:val="left"/>
-              <w:rPr/>
-            </w:pPr>
-            <w:r>
-              <w:rPr>
-                <w:rFonts w:eastAsia="Arial" w:cs="Arial" w:ascii="Arial" w:hAnsi="Arial"/>
-                <w:b/>
-                <w:color w:val="000000"/>
-                <w:sz w:val="24"/>
-                <w:szCs w:val="24"/>
-              </w:rPr>
-              <w:t>Atividade 03:</w:t>
-            </w:r>
-            <w:r>
-              <w:rPr>
-                <w:rFonts w:eastAsia="Arial" w:cs="Arial" w:ascii="Arial" w:hAnsi="Arial"/>
-                <w:color w:val="000000"/>
-                <w:sz w:val="24"/>
-                <w:szCs w:val="24"/>
-              </w:rPr>
-              <w:t xml:space="preserve"> {atividade1_3}</w:t>
+              <w:rPr>
+                <w:rFonts w:ascii="Arial" w:hAnsi="Arial" w:eastAsia="Arial" w:cs="Arial"/>
+                <w:color w:val="000000"/>
+                <w:sz w:val="24"/>
+                <w:szCs w:val="24"/>
+              </w:rPr>
+            </w:pPr>
+            <w:r>
+              <w:rPr>
+                <w:rFonts w:eastAsia="Arial" w:cs="Arial" w:ascii="Arial" w:hAnsi="Arial"/>
+                <w:color w:val="000000"/>
+                <w:sz w:val="24"/>
+                <w:szCs w:val="24"/>
+              </w:rPr>
             </w:r>
           </w:p>
         </w:tc>
@@ -1178,7 +1073,7 @@
         </w:trPr>
         <w:tc>
           <w:tcPr>
-            <w:tcW w:w="2070" w:type="dxa"/>
+            <w:tcW w:w="3044" w:type="dxa"/>
             <w:tcBorders>
               <w:top w:val="single" w:sz="4" w:space="0" w:color="000000"/>
               <w:left w:val="single" w:sz="4" w:space="0" w:color="000000"/>
@@ -1238,7 +1133,7 @@
         </w:tc>
         <w:tc>
           <w:tcPr>
-            <w:tcW w:w="5151" w:type="dxa"/>
+            <w:tcW w:w="7575" w:type="dxa"/>
             <w:tcBorders>
               <w:top w:val="single" w:sz="4" w:space="0" w:color="000000"/>
               <w:left w:val="single" w:sz="4" w:space="0" w:color="000000"/>
@@ -1332,8 +1227,8 @@
         <w:tblLook w:val="0000"/>
       </w:tblPr>
       <w:tblGrid>
-        <w:gridCol w:w="2085"/>
-        <w:gridCol w:w="5136"/>
+        <w:gridCol w:w="3070"/>
+        <w:gridCol w:w="7564"/>
       </w:tblGrid>
       <w:tr>
         <w:trPr>
@@ -1341,7 +1236,7 @@
         </w:trPr>
         <w:tc>
           <w:tcPr>
-            <w:tcW w:w="2085" w:type="dxa"/>
+            <w:tcW w:w="3070" w:type="dxa"/>
             <w:tcBorders>
               <w:left w:val="single" w:sz="4" w:space="0" w:color="000000"/>
               <w:bottom w:val="single" w:sz="4" w:space="0" w:color="000000"/>
@@ -1401,7 +1296,7 @@
         </w:tc>
         <w:tc>
           <w:tcPr>
-            <w:tcW w:w="5136" w:type="dxa"/>
+            <w:tcW w:w="7564" w:type="dxa"/>
             <w:tcBorders>
               <w:left w:val="single" w:sz="4" w:space="0" w:color="000000"/>
               <w:bottom w:val="single" w:sz="4" w:space="0" w:color="000000"/>
@@ -1488,7 +1383,7 @@
         </w:trPr>
         <w:tc>
           <w:tcPr>
-            <w:tcW w:w="2085" w:type="dxa"/>
+            <w:tcW w:w="3070" w:type="dxa"/>
             <w:tcBorders>
               <w:top w:val="single" w:sz="4" w:space="0" w:color="000000"/>
               <w:left w:val="single" w:sz="4" w:space="0" w:color="000000"/>
@@ -1548,7 +1443,7 @@
         </w:tc>
         <w:tc>
           <w:tcPr>
-            <w:tcW w:w="5136" w:type="dxa"/>
+            <w:tcW w:w="7564" w:type="dxa"/>
             <w:tcBorders>
               <w:top w:val="single" w:sz="4" w:space="0" w:color="000000"/>
               <w:left w:val="single" w:sz="4" w:space="0" w:color="000000"/>
@@ -1979,6 +1874,19 @@
     </w:pPr>
     <w:rPr/>
   </w:style>
+  <w:style w:type="paragraph" w:styleId="TableHeading">
+    <w:name w:val="Table Heading"/>
+    <w:basedOn w:val="TableContents"/>
+    <w:qFormat/>
+    <w:pPr>
+      <w:suppressLineNumbers/>
+      <w:jc w:val="center"/>
+    </w:pPr>
+    <w:rPr>
+      <w:b/>
+      <w:bCs/>
+    </w:rPr>
+  </w:style>
   <w:style w:type="table" w:default="1" w:styleId="TableNormal">
     <w:name w:val="TableNormal"/>
     <w:tblPr>

</xml_diff>

<commit_message>
:bug: fixing bug in .word docs
</commit_message>
<xml_diff>
--- a/public/planejamentoDiario1.docx
+++ b/public/planejamentoDiario1.docx
@@ -17,14 +17,12 @@
           <w:rFonts w:ascii="Arial" w:hAnsi="Arial" w:eastAsia="Arial" w:cs="Arial"/>
           <w:b w:val="false"/>
           <w:i w:val="false"/>
-          <w:i w:val="false"/>
           <w:caps w:val="false"/>
           <w:smallCaps w:val="false"/>
           <w:strike w:val="false"/>
           <w:dstrike w:val="false"/>
           <w:color w:val="000000"/>
           <w:position w:val="0"/>
-          <w:sz w:val="22"/>
           <w:sz w:val="22"/>
           <w:szCs w:val="22"/>
           <w:u w:val="none"/>
@@ -43,7 +41,6 @@
           <w:dstrike w:val="false"/>
           <w:color w:val="000000"/>
           <w:position w:val="0"/>
-          <w:sz w:val="22"/>
           <w:sz w:val="22"/>
           <w:szCs w:val="22"/>
           <w:u w:val="none"/>
@@ -69,7 +66,7 @@
       </w:tblPr>
       <w:tblGrid>
         <w:gridCol w:w="3107"/>
-        <w:gridCol w:w="7517"/>
+        <w:gridCol w:w="7518"/>
       </w:tblGrid>
       <w:tr>
         <w:trPr>
@@ -77,7 +74,7 @@
         </w:trPr>
         <w:tc>
           <w:tcPr>
-            <w:tcW w:w="10624" w:type="dxa"/>
+            <w:tcW w:w="10625" w:type="dxa"/>
             <w:gridSpan w:val="2"/>
             <w:tcBorders>
               <w:top w:val="single" w:sz="8" w:space="0" w:color="000000"/>
@@ -110,7 +107,6 @@
                 <w:rFonts w:ascii="Liberation Serif" w:hAnsi="Liberation Serif" w:eastAsia="Liberation Serif" w:cs="Liberation Serif"/>
                 <w:b/>
                 <w:i w:val="false"/>
-                <w:i w:val="false"/>
                 <w:strike w:val="false"/>
                 <w:dstrike w:val="false"/>
                 <w:color w:val="FFFFFF"/>
@@ -130,7 +126,6 @@
                 <w:dstrike w:val="false"/>
                 <w:color w:val="FFFFFF"/>
                 <w:position w:val="0"/>
-                <w:sz w:val="24"/>
                 <w:sz w:val="24"/>
                 <w:szCs w:val="24"/>
                 <w:u w:val="none"/>
@@ -161,7 +156,6 @@
                 <w:rFonts w:ascii="Liberation Serif" w:hAnsi="Liberation Serif" w:eastAsia="Liberation Serif" w:cs="Liberation Serif"/>
                 <w:b/>
                 <w:i w:val="false"/>
-                <w:i w:val="false"/>
                 <w:strike w:val="false"/>
                 <w:dstrike w:val="false"/>
                 <w:color w:val="FFFFFF"/>
@@ -182,13 +176,12 @@
                 <w:color w:val="FFFFFF"/>
                 <w:position w:val="0"/>
                 <w:sz w:val="24"/>
-                <w:sz w:val="24"/>
                 <w:szCs w:val="24"/>
                 <w:u w:val="none"/>
                 <w:shd w:fill="auto" w:val="clear"/>
                 <w:vertAlign w:val="baseline"/>
               </w:rPr>
-              <w:t>ROTINA SEMANAL - {diaStart} A {diaEnd} DE {mes}  DE {ano}</w:t>
+              <w:t>ROTINA SEMANAL – {diaStart} DE {mes} DE {ano}</w:t>
             </w:r>
           </w:p>
         </w:tc>
@@ -236,7 +229,6 @@
                 <w:color w:val="000000"/>
                 <w:position w:val="0"/>
                 <w:sz w:val="24"/>
-                <w:sz w:val="24"/>
                 <w:szCs w:val="24"/>
                 <w:u w:val="none"/>
                 <w:shd w:fill="auto" w:val="clear"/>
@@ -248,7 +240,7 @@
         </w:tc>
         <w:tc>
           <w:tcPr>
-            <w:tcW w:w="7517" w:type="dxa"/>
+            <w:tcW w:w="7518" w:type="dxa"/>
             <w:tcBorders>
               <w:top w:val="single" w:sz="8" w:space="0" w:color="000000"/>
               <w:left w:val="single" w:sz="8" w:space="0" w:color="000000"/>
@@ -284,7 +276,6 @@
                 <w:dstrike w:val="false"/>
                 <w:color w:val="000000"/>
                 <w:position w:val="0"/>
-                <w:sz w:val="24"/>
                 <w:sz w:val="24"/>
                 <w:szCs w:val="24"/>
                 <w:u w:val="none"/>
@@ -325,7 +316,6 @@
                 <w:rFonts w:ascii="Arial" w:hAnsi="Arial" w:eastAsia="Arial" w:cs="Arial"/>
                 <w:b w:val="false"/>
                 <w:i w:val="false"/>
-                <w:i w:val="false"/>
                 <w:caps w:val="false"/>
                 <w:smallCaps w:val="false"/>
                 <w:strike w:val="false"/>
@@ -333,7 +323,6 @@
                 <w:color w:val="000000"/>
                 <w:position w:val="0"/>
                 <w:sz w:val="24"/>
-                <w:sz w:val="24"/>
                 <w:szCs w:val="24"/>
                 <w:u w:val="none"/>
                 <w:shd w:fill="auto" w:val="clear"/>
@@ -351,7 +340,6 @@
                 <w:dstrike w:val="false"/>
                 <w:color w:val="000000"/>
                 <w:position w:val="0"/>
-                <w:sz w:val="24"/>
                 <w:sz w:val="24"/>
                 <w:szCs w:val="24"/>
                 <w:u w:val="none"/>
@@ -389,7 +377,6 @@
                 <w:color w:val="000000"/>
                 <w:position w:val="0"/>
                 <w:sz w:val="24"/>
-                <w:sz w:val="24"/>
                 <w:szCs w:val="24"/>
                 <w:u w:val="none"/>
                 <w:shd w:fill="auto" w:val="clear"/>
@@ -401,7 +388,7 @@
         </w:tc>
         <w:tc>
           <w:tcPr>
-            <w:tcW w:w="7517" w:type="dxa"/>
+            <w:tcW w:w="7518" w:type="dxa"/>
             <w:tcBorders>
               <w:top w:val="single" w:sz="8" w:space="0" w:color="000000"/>
               <w:left w:val="single" w:sz="8" w:space="0" w:color="000000"/>
@@ -468,7 +455,6 @@
                 <w:rFonts w:ascii="Arial" w:hAnsi="Arial" w:eastAsia="Arial" w:cs="Arial"/>
                 <w:b w:val="false"/>
                 <w:i w:val="false"/>
-                <w:i w:val="false"/>
                 <w:caps w:val="false"/>
                 <w:smallCaps w:val="false"/>
                 <w:strike w:val="false"/>
@@ -476,7 +462,6 @@
                 <w:color w:val="000000"/>
                 <w:position w:val="0"/>
                 <w:sz w:val="24"/>
-                <w:sz w:val="24"/>
                 <w:szCs w:val="24"/>
                 <w:u w:val="none"/>
                 <w:shd w:fill="auto" w:val="clear"/>
@@ -494,7 +479,6 @@
                 <w:dstrike w:val="false"/>
                 <w:color w:val="000000"/>
                 <w:position w:val="0"/>
-                <w:sz w:val="24"/>
                 <w:sz w:val="24"/>
                 <w:szCs w:val="24"/>
                 <w:u w:val="none"/>
@@ -506,7 +490,7 @@
         </w:tc>
         <w:tc>
           <w:tcPr>
-            <w:tcW w:w="7517" w:type="dxa"/>
+            <w:tcW w:w="7518" w:type="dxa"/>
             <w:tcBorders>
               <w:top w:val="single" w:sz="8" w:space="0" w:color="000000"/>
               <w:left w:val="single" w:sz="8" w:space="0" w:color="000000"/>
@@ -587,7 +571,6 @@
                 <w:rFonts w:ascii="Arial" w:hAnsi="Arial" w:eastAsia="Arial" w:cs="Arial"/>
                 <w:b w:val="false"/>
                 <w:i w:val="false"/>
-                <w:i w:val="false"/>
                 <w:caps w:val="false"/>
                 <w:smallCaps w:val="false"/>
                 <w:strike w:val="false"/>
@@ -595,7 +578,6 @@
                 <w:color w:val="000000"/>
                 <w:position w:val="0"/>
                 <w:sz w:val="24"/>
-                <w:sz w:val="24"/>
                 <w:szCs w:val="24"/>
                 <w:u w:val="none"/>
                 <w:shd w:fill="auto" w:val="clear"/>
@@ -613,7 +595,6 @@
                 <w:dstrike w:val="false"/>
                 <w:color w:val="000000"/>
                 <w:position w:val="0"/>
-                <w:sz w:val="24"/>
                 <w:sz w:val="24"/>
                 <w:szCs w:val="24"/>
                 <w:u w:val="none"/>
@@ -625,7 +606,7 @@
         </w:tc>
         <w:tc>
           <w:tcPr>
-            <w:tcW w:w="7517" w:type="dxa"/>
+            <w:tcW w:w="7518" w:type="dxa"/>
             <w:tcBorders>
               <w:top w:val="single" w:sz="8" w:space="0" w:color="000000"/>
               <w:left w:val="single" w:sz="8" w:space="0" w:color="000000"/>
@@ -736,7 +717,7 @@
       </w:tblPr>
       <w:tblGrid>
         <w:gridCol w:w="3229"/>
-        <w:gridCol w:w="7495"/>
+        <w:gridCol w:w="7496"/>
       </w:tblGrid>
       <w:tr>
         <w:trPr>
@@ -765,7 +746,6 @@
                 <w:rFonts w:ascii="Arial" w:hAnsi="Arial" w:eastAsia="Arial" w:cs="Arial"/>
                 <w:b w:val="false"/>
                 <w:i w:val="false"/>
-                <w:i w:val="false"/>
                 <w:caps w:val="false"/>
                 <w:smallCaps w:val="false"/>
                 <w:strike w:val="false"/>
@@ -773,7 +753,6 @@
                 <w:color w:val="000000"/>
                 <w:position w:val="0"/>
                 <w:sz w:val="24"/>
-                <w:sz w:val="24"/>
                 <w:szCs w:val="24"/>
                 <w:u w:val="none"/>
                 <w:shd w:fill="auto" w:val="clear"/>
@@ -791,7 +770,6 @@
                 <w:dstrike w:val="false"/>
                 <w:color w:val="000000"/>
                 <w:position w:val="0"/>
-                <w:sz w:val="24"/>
                 <w:sz w:val="24"/>
                 <w:szCs w:val="24"/>
                 <w:u w:val="none"/>
@@ -803,7 +781,7 @@
         </w:tc>
         <w:tc>
           <w:tcPr>
-            <w:tcW w:w="7495" w:type="dxa"/>
+            <w:tcW w:w="7496" w:type="dxa"/>
             <w:tcBorders>
               <w:left w:val="single" w:sz="4" w:space="0" w:color="000000"/>
               <w:bottom w:val="single" w:sz="4" w:space="0" w:color="000000"/>
@@ -908,7 +886,7 @@
         </w:tc>
         <w:tc>
           <w:tcPr>
-            <w:tcW w:w="7495" w:type="dxa"/>
+            <w:tcW w:w="7496" w:type="dxa"/>
             <w:tcBorders>
               <w:top w:val="single" w:sz="4" w:space="0" w:color="000000"/>
               <w:left w:val="single" w:sz="4" w:space="0" w:color="000000"/>
@@ -937,7 +915,27 @@
                 <w:sz w:val="24"/>
                 <w:szCs w:val="24"/>
               </w:rPr>
-              <w:t xml:space="preserve">Atividade 01: </w:t>
+              <w:t>Atividade</w:t>
+            </w:r>
+            <w:r>
+              <w:rPr>
+                <w:rFonts w:eastAsia="Arial" w:cs="Arial" w:ascii="Arial" w:hAnsi="Arial"/>
+                <w:b/>
+                <w:color w:val="000000"/>
+                <w:sz w:val="24"/>
+                <w:szCs w:val="24"/>
+              </w:rPr>
+              <w:t>(s)</w:t>
+            </w:r>
+            <w:r>
+              <w:rPr>
+                <w:rFonts w:eastAsia="Arial" w:cs="Arial" w:ascii="Arial" w:hAnsi="Arial"/>
+                <w:b/>
+                <w:color w:val="000000"/>
+                <w:sz w:val="24"/>
+                <w:szCs w:val="24"/>
+              </w:rPr>
+              <w:t xml:space="preserve">: </w:t>
             </w:r>
             <w:r>
               <w:rPr>
@@ -1003,7 +1001,7 @@
       </w:tblPr>
       <w:tblGrid>
         <w:gridCol w:w="3044"/>
-        <w:gridCol w:w="7575"/>
+        <w:gridCol w:w="7576"/>
       </w:tblGrid>
       <w:tr>
         <w:trPr>
@@ -1035,7 +1033,7 @@
         </w:tc>
         <w:tc>
           <w:tcPr>
-            <w:tcW w:w="7575" w:type="dxa"/>
+            <w:tcW w:w="7576" w:type="dxa"/>
             <w:tcBorders>
               <w:top w:val="single" w:sz="4" w:space="0" w:color="000000"/>
               <w:left w:val="single" w:sz="4" w:space="0" w:color="000000"/>
@@ -1095,7 +1093,6 @@
                 <w:rFonts w:ascii="Arial" w:hAnsi="Arial" w:eastAsia="Arial" w:cs="Arial"/>
                 <w:b w:val="false"/>
                 <w:i w:val="false"/>
-                <w:i w:val="false"/>
                 <w:caps w:val="false"/>
                 <w:smallCaps w:val="false"/>
                 <w:strike w:val="false"/>
@@ -1103,7 +1100,6 @@
                 <w:color w:val="000000"/>
                 <w:position w:val="0"/>
                 <w:sz w:val="24"/>
-                <w:sz w:val="24"/>
                 <w:szCs w:val="24"/>
                 <w:u w:val="none"/>
                 <w:shd w:fill="auto" w:val="clear"/>
@@ -1121,7 +1117,6 @@
                 <w:dstrike w:val="false"/>
                 <w:color w:val="000000"/>
                 <w:position w:val="0"/>
-                <w:sz w:val="24"/>
                 <w:sz w:val="24"/>
                 <w:szCs w:val="24"/>
                 <w:u w:val="none"/>
@@ -1133,7 +1128,7 @@
         </w:tc>
         <w:tc>
           <w:tcPr>
-            <w:tcW w:w="7575" w:type="dxa"/>
+            <w:tcW w:w="7576" w:type="dxa"/>
             <w:tcBorders>
               <w:top w:val="single" w:sz="4" w:space="0" w:color="000000"/>
               <w:left w:val="single" w:sz="4" w:space="0" w:color="000000"/>
@@ -1228,7 +1223,7 @@
       </w:tblPr>
       <w:tblGrid>
         <w:gridCol w:w="3070"/>
-        <w:gridCol w:w="7564"/>
+        <w:gridCol w:w="7565"/>
       </w:tblGrid>
       <w:tr>
         <w:trPr>
@@ -1258,7 +1253,6 @@
                 <w:rFonts w:ascii="Arial" w:hAnsi="Arial" w:eastAsia="Arial" w:cs="Arial"/>
                 <w:b w:val="false"/>
                 <w:i w:val="false"/>
-                <w:i w:val="false"/>
                 <w:caps w:val="false"/>
                 <w:smallCaps w:val="false"/>
                 <w:strike w:val="false"/>
@@ -1266,7 +1260,6 @@
                 <w:color w:val="000000"/>
                 <w:position w:val="0"/>
                 <w:sz w:val="24"/>
-                <w:sz w:val="24"/>
                 <w:szCs w:val="24"/>
                 <w:u w:val="none"/>
                 <w:shd w:fill="auto" w:val="clear"/>
@@ -1284,7 +1277,6 @@
                 <w:dstrike w:val="false"/>
                 <w:color w:val="000000"/>
                 <w:position w:val="0"/>
-                <w:sz w:val="24"/>
                 <w:sz w:val="24"/>
                 <w:szCs w:val="24"/>
                 <w:u w:val="none"/>
@@ -1296,7 +1288,7 @@
         </w:tc>
         <w:tc>
           <w:tcPr>
-            <w:tcW w:w="7564" w:type="dxa"/>
+            <w:tcW w:w="7565" w:type="dxa"/>
             <w:tcBorders>
               <w:left w:val="single" w:sz="4" w:space="0" w:color="000000"/>
               <w:bottom w:val="single" w:sz="4" w:space="0" w:color="000000"/>
@@ -1405,7 +1397,6 @@
                 <w:rFonts w:ascii="Arial" w:hAnsi="Arial" w:eastAsia="Arial" w:cs="Arial"/>
                 <w:b w:val="false"/>
                 <w:i w:val="false"/>
-                <w:i w:val="false"/>
                 <w:caps w:val="false"/>
                 <w:smallCaps w:val="false"/>
                 <w:strike w:val="false"/>
@@ -1413,7 +1404,6 @@
                 <w:color w:val="000000"/>
                 <w:position w:val="0"/>
                 <w:sz w:val="24"/>
-                <w:sz w:val="24"/>
                 <w:szCs w:val="24"/>
                 <w:u w:val="none"/>
                 <w:shd w:fill="auto" w:val="clear"/>
@@ -1431,7 +1421,6 @@
                 <w:dstrike w:val="false"/>
                 <w:color w:val="000000"/>
                 <w:position w:val="0"/>
-                <w:sz w:val="24"/>
                 <w:sz w:val="24"/>
                 <w:szCs w:val="24"/>
                 <w:u w:val="none"/>
@@ -1443,7 +1432,7 @@
         </w:tc>
         <w:tc>
           <w:tcPr>
-            <w:tcW w:w="7564" w:type="dxa"/>
+            <w:tcW w:w="7565" w:type="dxa"/>
             <w:tcBorders>
               <w:top w:val="single" w:sz="4" w:space="0" w:color="000000"/>
               <w:left w:val="single" w:sz="4" w:space="0" w:color="000000"/>
@@ -1590,7 +1579,6 @@
           <w:dstrike w:val="false"/>
           <w:color w:val="000000"/>
           <w:position w:val="0"/>
-          <w:sz w:val="24"/>
           <w:sz w:val="24"/>
           <w:szCs w:val="24"/>
           <w:u w:val="none"/>

</xml_diff>